<commit_message>
Add theme toggle, skip links, search a11y, admin dirty-state; rebuild site
</commit_message>
<xml_diff>
--- a/docs/downloads/البشير-بالخلاص-في-المسيح-1857/doc_0616.docx
+++ b/docs/downloads/البشير-بالخلاص-في-المسيح-1857/doc_0616.docx
@@ -1,6 +1,6 @@
 
 <file path=word/document.xml><?xml version="1.0" encoding="utf-8"?>
-<w:document xmlns:wpc="http://schemas.microsoft.com/office/word/2010/wordprocessingCanvas" xmlns:cx="http://schemas.microsoft.com/office/drawing/2014/chartex" xmlns:cx1="http://schemas.microsoft.com/office/drawing/2015/9/8/chartex" xmlns:cx2="http://schemas.microsoft.com/office/drawing/2015/10/21/chartex" xmlns:cx3="http://schemas.microsoft.com/office/drawing/2016/5/9/chartex" xmlns:cx4="http://schemas.microsoft.com/office/drawing/2016/5/10/chartex" xmlns:cx5="http://schemas.microsoft.com/office/drawing/2016/5/11/chartex" xmlns:cx6="http://schemas.microsoft.com/office/drawing/2016/5/12/chartex" xmlns:cx7="http://schemas.microsoft.com/office/drawing/2016/5/13/chartex" xmlns:cx8="http://schemas.microsoft.com/office/drawing/2016/5/14/chartex" xmlns:mc="http://schemas.openxmlformats.org/markup-compatibility/2006" xmlns:aink="http://schemas.microsoft.com/office/drawing/2016/ink" xmlns:am3d="http://schemas.microsoft.com/office/drawing/2017/model3d" xmlns:o="urn:schemas-microsoft-com:office:office" xmlns:oel="http://schemas.microsoft.com/office/2019/extlst" xmlns:r="http://schemas.openxmlformats.org/officeDocument/2006/relationships" xmlns:m="http://schemas.openxmlformats.org/officeDocument/2006/math" xmlns:v="urn:schemas-microsoft-com:vml" xmlns:wp14="http://schemas.microsoft.com/office/word/2010/wordprocessingDrawing" xmlns:wp="http://schemas.openxmlformats.org/drawingml/2006/wordprocessingDrawing" xmlns:w10="urn:schemas-microsoft-com:office:word" xmlns:w="http://schemas.openxmlformats.org/wordprocessingml/2006/main" xmlns:w14="http://schemas.microsoft.com/office/word/2010/wordml" xmlns:w15="http://schemas.microsoft.com/office/word/2012/wordml" xmlns:w16cex="http://schemas.microsoft.com/office/word/2018/wordml/cex" xmlns:w16cid="http://schemas.microsoft.com/office/word/2016/wordml/cid" xmlns:w16="http://schemas.microsoft.com/office/word/2018/wordml" xmlns:w16sdtdh="http://schemas.microsoft.com/office/word/2020/wordml/sdtdatahash" xmlns:w16se="http://schemas.microsoft.com/office/word/2015/wordml/symex" xmlns:wpg="http://schemas.microsoft.com/office/word/2010/wordprocessingGroup" xmlns:wpi="http://schemas.microsoft.com/office/word/2010/wordprocessingInk" xmlns:wne="http://schemas.microsoft.com/office/word/2006/wordml" xmlns:wps="http://schemas.microsoft.com/office/word/2010/wordprocessingShape" mc:Ignorable="w14 w15 w16se w16cid w16 w16cex w16sdtdh wp14">
+<w:document xmlns:wpc="http://schemas.microsoft.com/office/word/2010/wordprocessingCanvas" xmlns:cx="http://schemas.microsoft.com/office/drawing/2014/chartex" xmlns:cx1="http://schemas.microsoft.com/office/drawing/2015/9/8/chartex" xmlns:cx2="http://schemas.microsoft.com/office/drawing/2015/10/21/chartex" xmlns:cx3="http://schemas.microsoft.com/office/drawing/2016/5/9/chartex" xmlns:cx4="http://schemas.microsoft.com/office/drawing/2016/5/10/chartex" xmlns:cx5="http://schemas.microsoft.com/office/drawing/2016/5/11/chartex" xmlns:cx6="http://schemas.microsoft.com/office/drawing/2016/5/12/chartex" xmlns:cx7="http://schemas.microsoft.com/office/drawing/2016/5/13/chartex" xmlns:cx8="http://schemas.microsoft.com/office/drawing/2016/5/14/chartex" xmlns:mc="http://schemas.openxmlformats.org/markup-compatibility/2006" xmlns:aink="http://schemas.microsoft.com/office/drawing/2016/ink" xmlns:am3d="http://schemas.microsoft.com/office/drawing/2017/model3d" xmlns:o="urn:schemas-microsoft-com:office:office" xmlns:oel="http://schemas.microsoft.com/office/2019/extlst" xmlns:r="http://schemas.openxmlformats.org/officeDocument/2006/relationships" xmlns:m="http://schemas.openxmlformats.org/officeDocument/2006/math" xmlns:v="urn:schemas-microsoft-com:vml" xmlns:wp14="http://schemas.microsoft.com/office/word/2010/wordprocessingDrawing" xmlns:wp="http://schemas.openxmlformats.org/drawingml/2006/wordprocessingDrawing" xmlns:w10="urn:schemas-microsoft-com:office:word" xmlns:w="http://schemas.openxmlformats.org/wordprocessingml/2006/main" xmlns:w14="http://schemas.microsoft.com/office/word/2010/wordml" xmlns:w15="http://schemas.microsoft.com/office/word/2012/wordml" xmlns:w16cex="http://schemas.microsoft.com/office/word/2018/wordml/cex" xmlns:w16cid="http://schemas.microsoft.com/office/word/2016/wordml/cid" xmlns:w16="http://schemas.microsoft.com/office/word/2018/wordml" xmlns:w16du="http://schemas.microsoft.com/office/word/2023/wordml/word16du" xmlns:w16sdtdh="http://schemas.microsoft.com/office/word/2020/wordml/sdtdatahash" xmlns:w16sdtfl="http://schemas.microsoft.com/office/word/2024/wordml/sdtformatlock" xmlns:w16se="http://schemas.microsoft.com/office/word/2015/wordml/symex" xmlns:wpg="http://schemas.microsoft.com/office/word/2010/wordprocessingGroup" xmlns:wpi="http://schemas.microsoft.com/office/word/2010/wordprocessingInk" xmlns:wne="http://schemas.microsoft.com/office/word/2006/wordml" xmlns:wps="http://schemas.microsoft.com/office/word/2010/wordprocessingShape" mc:Ignorable="w14 w15 w16se w16cid w16 w16cex w16sdtdh w16sdtfl w16du wp14">
   <w:body>
     <w:p>
       <w:pPr>
@@ -931,7 +931,21 @@
           <w:rFonts w:hint="cs"/>
           <w:rtl/>
         </w:rPr>
-        <w:t xml:space="preserve">بالمناسبة إن معاهدة النعمة الغير مشروطة أساسها موجود في المعاهدة التي صُنعت (مع إبراهيم) من قبل أربعمئة </w:t>
+        <w:t xml:space="preserve">بالمناسبة إن معاهدة النعمة </w:t>
+      </w:r>
+      <w:r>
+        <w:rPr>
+          <w:rFonts w:hint="cs"/>
+          <w:rtl/>
+        </w:rPr>
+        <w:t>غير المشروطة</w:t>
+      </w:r>
+      <w:r>
+        <w:rPr>
+          <w:rFonts w:hint="cs"/>
+          <w:rtl/>
+        </w:rPr>
+        <w:t xml:space="preserve"> أساسها موجود في المعاهدة التي صُنعت (مع إبراهيم) من قبل أربعمئة </w:t>
       </w:r>
       <w:r>
         <w:rPr>
@@ -13771,16 +13785,182 @@
           <w:rFonts w:hint="cs"/>
           <w:rtl/>
         </w:rPr>
-        <w:t xml:space="preserve"> كما هو مع الكنيسة الجامعة جسد المسيح الذي يسكنه الروح، هكذا هو الأمر كذلك مع كل كنيسة محلية هي كنيسة أعضاء المسيح بقيادة الروح القدس في ذلك المكان؛ وبأنه بالتالي، ما يفعله أولئك الأعضاء يكم في أنهم يجتمعون معًا في اسم الرب ليسجدوا في الروح والحق. هذه هي الكنيسة وعبادتهم </w:t>
-      </w:r>
-      <w:hyperlink r:id="rId11" w:anchor=":~:text=Stattdessen%20aber%20sucht%20man%20da%2C%20wo%20man%20es%20nach" w:history="1">
+        <w:t xml:space="preserve"> كما هو مع الكنيسة الجامعة جسد المسيح الذي يسكنه الروح، هكذا هو الأمر كذلك مع كل كنيسة محلية هي كنيسة أعضاء المسيح بقيادة الروح القدس في ذلك المكان؛ وبأنه بالتالي، ما يفعله أولئك الأعضاء يكم في أنهم يجتمعون معًا في اسم الرب ليسجدوا في الروح والحق. هذه هي الكنيسة وعبادته</w:t>
+      </w:r>
+      <w:r>
+        <w:rPr>
+          <w:rFonts w:hint="cs"/>
+          <w:rtl/>
+        </w:rPr>
+        <w:t>ا</w:t>
+      </w:r>
+      <w:r>
+        <w:rPr>
+          <w:rFonts w:hint="cs"/>
+          <w:rtl/>
+        </w:rPr>
+        <w:t xml:space="preserve"> </w:t>
+      </w:r>
+      <w:r>
+        <w:rPr>
+          <w:rtl/>
+        </w:rPr>
+        <w:t>ل</w:t>
+      </w:r>
+      <w:r>
+        <w:rPr>
+          <w:rtl/>
+        </w:rPr>
+        <w:t>ل</w:t>
+      </w:r>
+      <w:r>
+        <w:rPr>
+          <w:rtl/>
+        </w:rPr>
+        <w:t>ه</w:t>
+      </w:r>
+      <w:r>
+        <w:rPr>
+          <w:rFonts w:hint="cs"/>
+          <w:rtl/>
+        </w:rPr>
+        <w:t>.</w:t>
+      </w:r>
+    </w:p>
+    <w:p>
+      <w:pPr>
+        <w:rPr>
+          <w:rtl/>
+        </w:rPr>
+      </w:pPr>
+      <w:r>
+        <w:rPr>
+          <w:rFonts w:hint="cs"/>
+          <w:rtl/>
+        </w:rPr>
+        <w:t xml:space="preserve">وبدلاً من ذلك فهنالك مَن يحاول بحسب ما تستهدفه حكمته الخاصة أن يُقيم كنائس. فهم ينشئون مدارس يثقفون فيها رعاة، معلمين، وباختصار خدامًا لهذه الكنائس بتعليمهم </w:t>
+      </w:r>
+      <w:r>
+        <w:rPr>
+          <w:rFonts w:hint="cs"/>
+          <w:rtl/>
+        </w:rPr>
+        <w:t>علومًا</w:t>
+      </w:r>
+      <w:r>
+        <w:rPr>
+          <w:rFonts w:hint="cs"/>
+          <w:rtl/>
+        </w:rPr>
+        <w:t>، وربما بالارتباط بإيمان أرثوذكسي. وينسون بأن الروح يوزع هباته في الكنيسة "كما يشاء" (1. كورنثوس 12: 4 -12)</w:t>
+      </w:r>
+      <w:r>
+        <w:rPr>
+          <w:rFonts w:hint="cs"/>
+          <w:rtl/>
+        </w:rPr>
+        <w:t>. ويصيغون ما كان على الروح إظهاره بتأثير عمله القدير والحر في مؤلفات وصيغ؛ بينما هذه الأمور هي أمام الله صحيحة ولها قيمتها بمدى أن الروح هو مَن يقدمها. كيف سيُربح العالم للإيمان إن رأى بأن المعترفين بهذا الروح هم بأنفسهم في الواقع لا يأتمنونه على أنفسهم، وإنما</w:t>
+      </w:r>
+      <w:r>
+        <w:rPr>
+          <w:rFonts w:hint="cs"/>
+          <w:rtl/>
+        </w:rPr>
+        <w:t xml:space="preserve"> استنادهم هو على حكمة صيغهم وعلى موهبة فن خطابة معلميهم؟ أفلن ينسحب الروح المحزون تاركًا المكان؟ إنهم كإسرائيل الذي لم يقر بامتيازه بأن يكون الله ملكًا عليه وقال: نريد ملكًا كباقي الشعوب أيضًا.</w:t>
+      </w:r>
+    </w:p>
+    <w:p>
+      <w:pPr>
+        <w:rPr>
+          <w:rtl/>
+        </w:rPr>
+      </w:pPr>
+      <w:r>
+        <w:rPr>
+          <w:rFonts w:hint="cs"/>
+          <w:rtl/>
+        </w:rPr>
+        <w:t xml:space="preserve">فعلى الكنيسة أن </w:t>
+      </w:r>
+      <w:r>
+        <w:rPr>
+          <w:rFonts w:hint="cs"/>
+          <w:rtl/>
+        </w:rPr>
+        <w:t xml:space="preserve">تشهد عن حياة رأسها الذي قام، في انتظارها له يوميًا من السماء، كما فعلت في بداية نشأتها أيضًا. عندما نقرأ رسائل الرسل بكل بساطة فمن المستحيل أن لا نلاحظ بأن المسيحيين الأوائل انتظروا الرب بطريقة مختلفة تمامًا عن ما يفعله معظم المسيحيين في أيامنا. فهم فعلاً انتظروه وليس روحيًا؛ وقد آمنوا بأنه </w:t>
+      </w:r>
+      <w:proofErr w:type="spellStart"/>
+      <w:r>
+        <w:rPr>
+          <w:rFonts w:hint="cs"/>
+          <w:rtl/>
+        </w:rPr>
+        <w:t>سيجيء</w:t>
+      </w:r>
+      <w:proofErr w:type="spellEnd"/>
+      <w:r>
+        <w:rPr>
+          <w:rFonts w:hint="cs"/>
+          <w:rtl/>
+        </w:rPr>
+        <w:t xml:space="preserve"> في كل لحظة. فالمجيء كان بالنسبة لهم الغاية التي لأجلها رجعوا عن طرقهم، وهو الدافع للقيام بمسؤولياتهم وعزاء في أحزانهم (1. تسالونيكي 1: 9 -10؛ 2: 19، 20؛ 4: 18؛ </w:t>
+      </w:r>
+      <w:proofErr w:type="spellStart"/>
+      <w:r>
+        <w:rPr>
+          <w:rFonts w:hint="cs"/>
+          <w:rtl/>
+        </w:rPr>
+        <w:t>تيطس</w:t>
+      </w:r>
+      <w:proofErr w:type="spellEnd"/>
+      <w:r>
+        <w:rPr>
+          <w:rFonts w:hint="cs"/>
+          <w:rtl/>
+        </w:rPr>
+        <w:t xml:space="preserve"> 2: 13؛ عبرانيين 10: 36 </w:t>
+      </w:r>
+      <w:r>
+        <w:rPr>
+          <w:rtl/>
+        </w:rPr>
+        <w:t>–</w:t>
+      </w:r>
+      <w:r>
+        <w:rPr>
+          <w:rFonts w:hint="cs"/>
+          <w:rtl/>
+        </w:rPr>
+        <w:t xml:space="preserve"> 37؛ يعقوب 5: 7 </w:t>
+      </w:r>
+      <w:r>
+        <w:rPr>
+          <w:rtl/>
+        </w:rPr>
+        <w:t>–</w:t>
+      </w:r>
+      <w:r>
+        <w:rPr>
+          <w:rFonts w:hint="cs"/>
+          <w:rtl/>
+        </w:rPr>
+        <w:t xml:space="preserve"> 9). إلا أنهم ابتعدوا كثيرًا عن فِكر أولئك التلاميذ الأوائل، إذ لم يعودوا يفهمون لغتهم منحوا لأبسط عباراتهم مفهومًا غريبًا غصبًا. </w:t>
+      </w:r>
+      <w:r>
+        <w:rPr>
+          <w:rFonts w:hint="cs"/>
+          <w:rtl/>
+        </w:rPr>
+        <w:t xml:space="preserve">وقد أصبح مجيء الرب للكثيرين بأنه فقط خراب أورشليم أو الموت أو كذلك شيء دعوه بالمجيء الروحي، لإقامة ملكوت يُدعى ملكوت روحي، والذي لا تعرف عنه الكلمة أي </w:t>
+      </w:r>
+      <w:hyperlink r:id="rId11" w:anchor=":~:text=Die%20meisten%20kennen%20keine%20andere%20Ankunft%20des%20Herrn%20als%20diejenige%2C" w:history="1">
         <w:r>
           <w:rPr>
             <w:rStyle w:val="Hyperlink"/>
-            <w:rFonts w:hint="cs"/>
             <w:rtl/>
           </w:rPr>
-          <w:t>لله</w:t>
+          <w:t>شيء</w:t>
         </w:r>
       </w:hyperlink>
       <w:r>
@@ -13808,7 +13988,7 @@
 </file>
 
 <file path=word/endnotes.xml><?xml version="1.0" encoding="utf-8"?>
-<w:endnotes xmlns:wpc="http://schemas.microsoft.com/office/word/2010/wordprocessingCanvas" xmlns:cx="http://schemas.microsoft.com/office/drawing/2014/chartex" xmlns:cx1="http://schemas.microsoft.com/office/drawing/2015/9/8/chartex" xmlns:cx2="http://schemas.microsoft.com/office/drawing/2015/10/21/chartex" xmlns:cx3="http://schemas.microsoft.com/office/drawing/2016/5/9/chartex" xmlns:cx4="http://schemas.microsoft.com/office/drawing/2016/5/10/chartex" xmlns:cx5="http://schemas.microsoft.com/office/drawing/2016/5/11/chartex" xmlns:cx6="http://schemas.microsoft.com/office/drawing/2016/5/12/chartex" xmlns:cx7="http://schemas.microsoft.com/office/drawing/2016/5/13/chartex" xmlns:cx8="http://schemas.microsoft.com/office/drawing/2016/5/14/chartex" xmlns:mc="http://schemas.openxmlformats.org/markup-compatibility/2006" xmlns:aink="http://schemas.microsoft.com/office/drawing/2016/ink" xmlns:am3d="http://schemas.microsoft.com/office/drawing/2017/model3d" xmlns:o="urn:schemas-microsoft-com:office:office" xmlns:oel="http://schemas.microsoft.com/office/2019/extlst" xmlns:r="http://schemas.openxmlformats.org/officeDocument/2006/relationships" xmlns:m="http://schemas.openxmlformats.org/officeDocument/2006/math" xmlns:v="urn:schemas-microsoft-com:vml" xmlns:wp14="http://schemas.microsoft.com/office/word/2010/wordprocessingDrawing" xmlns:wp="http://schemas.openxmlformats.org/drawingml/2006/wordprocessingDrawing" xmlns:w10="urn:schemas-microsoft-com:office:word" xmlns:w="http://schemas.openxmlformats.org/wordprocessingml/2006/main" xmlns:w14="http://schemas.microsoft.com/office/word/2010/wordml" xmlns:w15="http://schemas.microsoft.com/office/word/2012/wordml" xmlns:w16cex="http://schemas.microsoft.com/office/word/2018/wordml/cex" xmlns:w16cid="http://schemas.microsoft.com/office/word/2016/wordml/cid" xmlns:w16="http://schemas.microsoft.com/office/word/2018/wordml" xmlns:w16sdtdh="http://schemas.microsoft.com/office/word/2020/wordml/sdtdatahash" xmlns:w16se="http://schemas.microsoft.com/office/word/2015/wordml/symex" xmlns:wpg="http://schemas.microsoft.com/office/word/2010/wordprocessingGroup" xmlns:wpi="http://schemas.microsoft.com/office/word/2010/wordprocessingInk" xmlns:wne="http://schemas.microsoft.com/office/word/2006/wordml" xmlns:wps="http://schemas.microsoft.com/office/word/2010/wordprocessingShape" mc:Ignorable="w14 w15 w16se w16cid w16 w16cex w16sdtdh wp14">
+<w:endnotes xmlns:wpc="http://schemas.microsoft.com/office/word/2010/wordprocessingCanvas" xmlns:cx="http://schemas.microsoft.com/office/drawing/2014/chartex" xmlns:cx1="http://schemas.microsoft.com/office/drawing/2015/9/8/chartex" xmlns:cx2="http://schemas.microsoft.com/office/drawing/2015/10/21/chartex" xmlns:cx3="http://schemas.microsoft.com/office/drawing/2016/5/9/chartex" xmlns:cx4="http://schemas.microsoft.com/office/drawing/2016/5/10/chartex" xmlns:cx5="http://schemas.microsoft.com/office/drawing/2016/5/11/chartex" xmlns:cx6="http://schemas.microsoft.com/office/drawing/2016/5/12/chartex" xmlns:cx7="http://schemas.microsoft.com/office/drawing/2016/5/13/chartex" xmlns:cx8="http://schemas.microsoft.com/office/drawing/2016/5/14/chartex" xmlns:mc="http://schemas.openxmlformats.org/markup-compatibility/2006" xmlns:aink="http://schemas.microsoft.com/office/drawing/2016/ink" xmlns:am3d="http://schemas.microsoft.com/office/drawing/2017/model3d" xmlns:o="urn:schemas-microsoft-com:office:office" xmlns:oel="http://schemas.microsoft.com/office/2019/extlst" xmlns:r="http://schemas.openxmlformats.org/officeDocument/2006/relationships" xmlns:m="http://schemas.openxmlformats.org/officeDocument/2006/math" xmlns:v="urn:schemas-microsoft-com:vml" xmlns:wp14="http://schemas.microsoft.com/office/word/2010/wordprocessingDrawing" xmlns:wp="http://schemas.openxmlformats.org/drawingml/2006/wordprocessingDrawing" xmlns:w10="urn:schemas-microsoft-com:office:word" xmlns:w="http://schemas.openxmlformats.org/wordprocessingml/2006/main" xmlns:w14="http://schemas.microsoft.com/office/word/2010/wordml" xmlns:w15="http://schemas.microsoft.com/office/word/2012/wordml" xmlns:w16cex="http://schemas.microsoft.com/office/word/2018/wordml/cex" xmlns:w16cid="http://schemas.microsoft.com/office/word/2016/wordml/cid" xmlns:w16="http://schemas.microsoft.com/office/word/2018/wordml" xmlns:w16du="http://schemas.microsoft.com/office/word/2023/wordml/word16du" xmlns:w16sdtdh="http://schemas.microsoft.com/office/word/2020/wordml/sdtdatahash" xmlns:w16sdtfl="http://schemas.microsoft.com/office/word/2024/wordml/sdtformatlock" xmlns:w16se="http://schemas.microsoft.com/office/word/2015/wordml/symex" xmlns:wpg="http://schemas.microsoft.com/office/word/2010/wordprocessingGroup" xmlns:wpi="http://schemas.microsoft.com/office/word/2010/wordprocessingInk" xmlns:wne="http://schemas.microsoft.com/office/word/2006/wordml" xmlns:wps="http://schemas.microsoft.com/office/word/2010/wordprocessingShape" mc:Ignorable="w14 w15 w16se w16cid w16 w16cex w16sdtdh w16sdtfl w16du wp14">
   <w:endnote w:type="separator" w:id="-1">
     <w:p>
       <w:pPr>
@@ -13833,7 +14013,7 @@
 </file>
 
 <file path=word/footnotes.xml><?xml version="1.0" encoding="utf-8"?>
-<w:footnotes xmlns:wpc="http://schemas.microsoft.com/office/word/2010/wordprocessingCanvas" xmlns:cx="http://schemas.microsoft.com/office/drawing/2014/chartex" xmlns:cx1="http://schemas.microsoft.com/office/drawing/2015/9/8/chartex" xmlns:cx2="http://schemas.microsoft.com/office/drawing/2015/10/21/chartex" xmlns:cx3="http://schemas.microsoft.com/office/drawing/2016/5/9/chartex" xmlns:cx4="http://schemas.microsoft.com/office/drawing/2016/5/10/chartex" xmlns:cx5="http://schemas.microsoft.com/office/drawing/2016/5/11/chartex" xmlns:cx6="http://schemas.microsoft.com/office/drawing/2016/5/12/chartex" xmlns:cx7="http://schemas.microsoft.com/office/drawing/2016/5/13/chartex" xmlns:cx8="http://schemas.microsoft.com/office/drawing/2016/5/14/chartex" xmlns:mc="http://schemas.openxmlformats.org/markup-compatibility/2006" xmlns:aink="http://schemas.microsoft.com/office/drawing/2016/ink" xmlns:am3d="http://schemas.microsoft.com/office/drawing/2017/model3d" xmlns:o="urn:schemas-microsoft-com:office:office" xmlns:oel="http://schemas.microsoft.com/office/2019/extlst" xmlns:r="http://schemas.openxmlformats.org/officeDocument/2006/relationships" xmlns:m="http://schemas.openxmlformats.org/officeDocument/2006/math" xmlns:v="urn:schemas-microsoft-com:vml" xmlns:wp14="http://schemas.microsoft.com/office/word/2010/wordprocessingDrawing" xmlns:wp="http://schemas.openxmlformats.org/drawingml/2006/wordprocessingDrawing" xmlns:w10="urn:schemas-microsoft-com:office:word" xmlns:w="http://schemas.openxmlformats.org/wordprocessingml/2006/main" xmlns:w14="http://schemas.microsoft.com/office/word/2010/wordml" xmlns:w15="http://schemas.microsoft.com/office/word/2012/wordml" xmlns:w16cex="http://schemas.microsoft.com/office/word/2018/wordml/cex" xmlns:w16cid="http://schemas.microsoft.com/office/word/2016/wordml/cid" xmlns:w16="http://schemas.microsoft.com/office/word/2018/wordml" xmlns:w16sdtdh="http://schemas.microsoft.com/office/word/2020/wordml/sdtdatahash" xmlns:w16se="http://schemas.microsoft.com/office/word/2015/wordml/symex" xmlns:wpg="http://schemas.microsoft.com/office/word/2010/wordprocessingGroup" xmlns:wpi="http://schemas.microsoft.com/office/word/2010/wordprocessingInk" xmlns:wne="http://schemas.microsoft.com/office/word/2006/wordml" xmlns:wps="http://schemas.microsoft.com/office/word/2010/wordprocessingShape" mc:Ignorable="w14 w15 w16se w16cid w16 w16cex w16sdtdh wp14">
+<w:footnotes xmlns:wpc="http://schemas.microsoft.com/office/word/2010/wordprocessingCanvas" xmlns:cx="http://schemas.microsoft.com/office/drawing/2014/chartex" xmlns:cx1="http://schemas.microsoft.com/office/drawing/2015/9/8/chartex" xmlns:cx2="http://schemas.microsoft.com/office/drawing/2015/10/21/chartex" xmlns:cx3="http://schemas.microsoft.com/office/drawing/2016/5/9/chartex" xmlns:cx4="http://schemas.microsoft.com/office/drawing/2016/5/10/chartex" xmlns:cx5="http://schemas.microsoft.com/office/drawing/2016/5/11/chartex" xmlns:cx6="http://schemas.microsoft.com/office/drawing/2016/5/12/chartex" xmlns:cx7="http://schemas.microsoft.com/office/drawing/2016/5/13/chartex" xmlns:cx8="http://schemas.microsoft.com/office/drawing/2016/5/14/chartex" xmlns:mc="http://schemas.openxmlformats.org/markup-compatibility/2006" xmlns:aink="http://schemas.microsoft.com/office/drawing/2016/ink" xmlns:am3d="http://schemas.microsoft.com/office/drawing/2017/model3d" xmlns:o="urn:schemas-microsoft-com:office:office" xmlns:oel="http://schemas.microsoft.com/office/2019/extlst" xmlns:r="http://schemas.openxmlformats.org/officeDocument/2006/relationships" xmlns:m="http://schemas.openxmlformats.org/officeDocument/2006/math" xmlns:v="urn:schemas-microsoft-com:vml" xmlns:wp14="http://schemas.microsoft.com/office/word/2010/wordprocessingDrawing" xmlns:wp="http://schemas.openxmlformats.org/drawingml/2006/wordprocessingDrawing" xmlns:w10="urn:schemas-microsoft-com:office:word" xmlns:w="http://schemas.openxmlformats.org/wordprocessingml/2006/main" xmlns:w14="http://schemas.microsoft.com/office/word/2010/wordml" xmlns:w15="http://schemas.microsoft.com/office/word/2012/wordml" xmlns:w16cex="http://schemas.microsoft.com/office/word/2018/wordml/cex" xmlns:w16cid="http://schemas.microsoft.com/office/word/2016/wordml/cid" xmlns:w16="http://schemas.microsoft.com/office/word/2018/wordml" xmlns:w16du="http://schemas.microsoft.com/office/word/2023/wordml/word16du" xmlns:w16sdtdh="http://schemas.microsoft.com/office/word/2020/wordml/sdtdatahash" xmlns:w16sdtfl="http://schemas.microsoft.com/office/word/2024/wordml/sdtformatlock" xmlns:w16se="http://schemas.microsoft.com/office/word/2015/wordml/symex" xmlns:wpg="http://schemas.microsoft.com/office/word/2010/wordprocessingGroup" xmlns:wpi="http://schemas.microsoft.com/office/word/2010/wordprocessingInk" xmlns:wne="http://schemas.microsoft.com/office/word/2006/wordml" xmlns:wps="http://schemas.microsoft.com/office/word/2010/wordprocessingShape" mc:Ignorable="w14 w15 w16se w16cid w16 w16cex w16sdtdh w16sdtfl w16du wp14">
   <w:footnote w:type="separator" w:id="-1">
     <w:p>
       <w:pPr>
@@ -14376,7 +14556,7 @@
 </file>
 
 <file path=word/numbering.xml><?xml version="1.0" encoding="utf-8"?>
-<w:numbering xmlns:wpc="http://schemas.microsoft.com/office/word/2010/wordprocessingCanvas" xmlns:cx="http://schemas.microsoft.com/office/drawing/2014/chartex" xmlns:cx1="http://schemas.microsoft.com/office/drawing/2015/9/8/chartex" xmlns:cx2="http://schemas.microsoft.com/office/drawing/2015/10/21/chartex" xmlns:cx3="http://schemas.microsoft.com/office/drawing/2016/5/9/chartex" xmlns:cx4="http://schemas.microsoft.com/office/drawing/2016/5/10/chartex" xmlns:cx5="http://schemas.microsoft.com/office/drawing/2016/5/11/chartex" xmlns:cx6="http://schemas.microsoft.com/office/drawing/2016/5/12/chartex" xmlns:cx7="http://schemas.microsoft.com/office/drawing/2016/5/13/chartex" xmlns:cx8="http://schemas.microsoft.com/office/drawing/2016/5/14/chartex" xmlns:mc="http://schemas.openxmlformats.org/markup-compatibility/2006" xmlns:aink="http://schemas.microsoft.com/office/drawing/2016/ink" xmlns:am3d="http://schemas.microsoft.com/office/drawing/2017/model3d" xmlns:o="urn:schemas-microsoft-com:office:office" xmlns:oel="http://schemas.microsoft.com/office/2019/extlst" xmlns:r="http://schemas.openxmlformats.org/officeDocument/2006/relationships" xmlns:m="http://schemas.openxmlformats.org/officeDocument/2006/math" xmlns:v="urn:schemas-microsoft-com:vml" xmlns:wp14="http://schemas.microsoft.com/office/word/2010/wordprocessingDrawing" xmlns:wp="http://schemas.openxmlformats.org/drawingml/2006/wordprocessingDrawing" xmlns:w10="urn:schemas-microsoft-com:office:word" xmlns:w="http://schemas.openxmlformats.org/wordprocessingml/2006/main" xmlns:w14="http://schemas.microsoft.com/office/word/2010/wordml" xmlns:w15="http://schemas.microsoft.com/office/word/2012/wordml" xmlns:w16cex="http://schemas.microsoft.com/office/word/2018/wordml/cex" xmlns:w16cid="http://schemas.microsoft.com/office/word/2016/wordml/cid" xmlns:w16="http://schemas.microsoft.com/office/word/2018/wordml" xmlns:w16sdtdh="http://schemas.microsoft.com/office/word/2020/wordml/sdtdatahash" xmlns:w16se="http://schemas.microsoft.com/office/word/2015/wordml/symex" xmlns:wpg="http://schemas.microsoft.com/office/word/2010/wordprocessingGroup" xmlns:wpi="http://schemas.microsoft.com/office/word/2010/wordprocessingInk" xmlns:wne="http://schemas.microsoft.com/office/word/2006/wordml" xmlns:wps="http://schemas.microsoft.com/office/word/2010/wordprocessingShape" mc:Ignorable="w14 w15 w16se w16cid w16 w16cex w16sdtdh wp14">
+<w:numbering xmlns:wpc="http://schemas.microsoft.com/office/word/2010/wordprocessingCanvas" xmlns:cx="http://schemas.microsoft.com/office/drawing/2014/chartex" xmlns:cx1="http://schemas.microsoft.com/office/drawing/2015/9/8/chartex" xmlns:cx2="http://schemas.microsoft.com/office/drawing/2015/10/21/chartex" xmlns:cx3="http://schemas.microsoft.com/office/drawing/2016/5/9/chartex" xmlns:cx4="http://schemas.microsoft.com/office/drawing/2016/5/10/chartex" xmlns:cx5="http://schemas.microsoft.com/office/drawing/2016/5/11/chartex" xmlns:cx6="http://schemas.microsoft.com/office/drawing/2016/5/12/chartex" xmlns:cx7="http://schemas.microsoft.com/office/drawing/2016/5/13/chartex" xmlns:cx8="http://schemas.microsoft.com/office/drawing/2016/5/14/chartex" xmlns:mc="http://schemas.openxmlformats.org/markup-compatibility/2006" xmlns:aink="http://schemas.microsoft.com/office/drawing/2016/ink" xmlns:am3d="http://schemas.microsoft.com/office/drawing/2017/model3d" xmlns:o="urn:schemas-microsoft-com:office:office" xmlns:oel="http://schemas.microsoft.com/office/2019/extlst" xmlns:r="http://schemas.openxmlformats.org/officeDocument/2006/relationships" xmlns:m="http://schemas.openxmlformats.org/officeDocument/2006/math" xmlns:v="urn:schemas-microsoft-com:vml" xmlns:wp14="http://schemas.microsoft.com/office/word/2010/wordprocessingDrawing" xmlns:wp="http://schemas.openxmlformats.org/drawingml/2006/wordprocessingDrawing" xmlns:w10="urn:schemas-microsoft-com:office:word" xmlns:w="http://schemas.openxmlformats.org/wordprocessingml/2006/main" xmlns:w14="http://schemas.microsoft.com/office/word/2010/wordml" xmlns:w15="http://schemas.microsoft.com/office/word/2012/wordml" xmlns:w16cex="http://schemas.microsoft.com/office/word/2018/wordml/cex" xmlns:w16cid="http://schemas.microsoft.com/office/word/2016/wordml/cid" xmlns:w16="http://schemas.microsoft.com/office/word/2018/wordml" xmlns:w16du="http://schemas.microsoft.com/office/word/2023/wordml/word16du" xmlns:w16sdtdh="http://schemas.microsoft.com/office/word/2020/wordml/sdtdatahash" xmlns:w16sdtfl="http://schemas.microsoft.com/office/word/2024/wordml/sdtformatlock" xmlns:w16se="http://schemas.microsoft.com/office/word/2015/wordml/symex" xmlns:wpg="http://schemas.microsoft.com/office/word/2010/wordprocessingGroup" xmlns:wpi="http://schemas.microsoft.com/office/word/2010/wordprocessingInk" xmlns:wne="http://schemas.microsoft.com/office/word/2006/wordml" xmlns:wps="http://schemas.microsoft.com/office/word/2010/wordprocessingShape" mc:Ignorable="w14 w15 w16se w16cid w16 w16cex w16sdtdh w16sdtfl w16du wp14">
   <w:abstractNum w:abstractNumId="0" w15:restartNumberingAfterBreak="0">
     <w:nsid w:val="08264DBA"/>
     <w:multiLevelType w:val="hybridMultilevel"/>
@@ -14588,7 +14768,7 @@
 </file>
 
 <file path=word/styles.xml><?xml version="1.0" encoding="utf-8"?>
-<w:styles xmlns:mc="http://schemas.openxmlformats.org/markup-compatibility/2006" xmlns:r="http://schemas.openxmlformats.org/officeDocument/2006/relationships" xmlns:w="http://schemas.openxmlformats.org/wordprocessingml/2006/main" xmlns:w14="http://schemas.microsoft.com/office/word/2010/wordml" xmlns:w15="http://schemas.microsoft.com/office/word/2012/wordml" xmlns:w16cex="http://schemas.microsoft.com/office/word/2018/wordml/cex" xmlns:w16cid="http://schemas.microsoft.com/office/word/2016/wordml/cid" xmlns:w16="http://schemas.microsoft.com/office/word/2018/wordml" xmlns:w16sdtdh="http://schemas.microsoft.com/office/word/2020/wordml/sdtdatahash" xmlns:w16se="http://schemas.microsoft.com/office/word/2015/wordml/symex" mc:Ignorable="w14 w15 w16se w16cid w16 w16cex w16sdtdh">
+<w:styles xmlns:mc="http://schemas.openxmlformats.org/markup-compatibility/2006" xmlns:r="http://schemas.openxmlformats.org/officeDocument/2006/relationships" xmlns:w="http://schemas.openxmlformats.org/wordprocessingml/2006/main" xmlns:w14="http://schemas.microsoft.com/office/word/2010/wordml" xmlns:w15="http://schemas.microsoft.com/office/word/2012/wordml" xmlns:w16cex="http://schemas.microsoft.com/office/word/2018/wordml/cex" xmlns:w16cid="http://schemas.microsoft.com/office/word/2016/wordml/cid" xmlns:w16="http://schemas.microsoft.com/office/word/2018/wordml" xmlns:w16du="http://schemas.microsoft.com/office/word/2023/wordml/word16du" xmlns:w16sdtdh="http://schemas.microsoft.com/office/word/2020/wordml/sdtdatahash" xmlns:w16sdtfl="http://schemas.microsoft.com/office/word/2024/wordml/sdtformatlock" xmlns:w16se="http://schemas.microsoft.com/office/word/2015/wordml/symex" mc:Ignorable="w14 w15 w16se w16cid w16 w16cex w16sdtdh w16sdtfl w16du">
   <w:docDefaults>
     <w:rPrDefault>
       <w:rPr>

</xml_diff>

<commit_message>
Replace doc_overrides.json with hidden/تم folders; make admin panel read-only
</commit_message>
<xml_diff>
--- a/docs/downloads/البشير-بالخلاص-في-المسيح-1857/doc_0616.docx
+++ b/docs/downloads/البشير-بالخلاص-في-المسيح-1857/doc_0616.docx
@@ -13805,19 +13805,7 @@
         <w:rPr>
           <w:rtl/>
         </w:rPr>
-        <w:t>ل</w:t>
-      </w:r>
-      <w:r>
-        <w:rPr>
-          <w:rtl/>
-        </w:rPr>
-        <w:t>ل</w:t>
-      </w:r>
-      <w:r>
-        <w:rPr>
-          <w:rtl/>
-        </w:rPr>
-        <w:t>ه</w:t>
+        <w:t>لله</w:t>
       </w:r>
       <w:r>
         <w:rPr>
@@ -13903,7 +13891,21 @@
           <w:rFonts w:hint="cs"/>
           <w:rtl/>
         </w:rPr>
-        <w:t xml:space="preserve"> في كل لحظة. فالمجيء كان بالنسبة لهم الغاية التي لأجلها رجعوا عن طرقهم، وهو الدافع للقيام بمسؤولياتهم وعزاء في أحزانهم (1. تسالونيكي 1: 9 -10؛ 2: 19، 20؛ 4: 18؛ </w:t>
+        <w:t xml:space="preserve"> في كل لحظة. فالمجيء كان بالنسبة لهم الغاية التي لأجلها رجعوا عن طرقهم، وهو الدافع للقيام بمسؤولياتهم و</w:t>
+      </w:r>
+      <w:r>
+        <w:rPr>
+          <w:rFonts w:hint="cs"/>
+          <w:rtl/>
+        </w:rPr>
+        <w:t>ال</w:t>
+      </w:r>
+      <w:r>
+        <w:rPr>
+          <w:rFonts w:hint="cs"/>
+          <w:rtl/>
+        </w:rPr>
+        <w:t xml:space="preserve">عزاء في أحزانهم (1. تسالونيكي 1: 9 -10؛ 2: 19، 20؛ 4: 18؛ </w:t>
       </w:r>
       <w:proofErr w:type="spellStart"/>
       <w:r>
@@ -13954,15 +13956,12 @@
         </w:rPr>
         <w:t xml:space="preserve">وقد أصبح مجيء الرب للكثيرين بأنه فقط خراب أورشليم أو الموت أو كذلك شيء دعوه بالمجيء الروحي، لإقامة ملكوت يُدعى ملكوت روحي، والذي لا تعرف عنه الكلمة أي </w:t>
       </w:r>
-      <w:hyperlink r:id="rId11" w:anchor=":~:text=Die%20meisten%20kennen%20keine%20andere%20Ankunft%20des%20Herrn%20als%20diejenige%2C" w:history="1">
-        <w:r>
-          <w:rPr>
-            <w:rStyle w:val="Hyperlink"/>
-            <w:rtl/>
-          </w:rPr>
-          <w:t>شيء</w:t>
-        </w:r>
-      </w:hyperlink>
+      <w:r>
+        <w:rPr>
+          <w:rtl/>
+        </w:rPr>
+        <w:t>شيء</w:t>
+      </w:r>
       <w:r>
         <w:rPr>
           <w:rFonts w:hint="cs"/>
@@ -13971,7 +13970,78 @@
         <w:t>.</w:t>
       </w:r>
     </w:p>
-    <w:p/>
+    <w:p>
+      <w:r>
+        <w:rPr>
+          <w:rFonts w:hint="cs"/>
+          <w:rtl/>
+        </w:rPr>
+        <w:t>المعظم لا يعرف مجيئًا آخر للرب غير الذي سيدين فيه العالم، وبالتالي يخلطون يوم غضب الخروف باليوم المحبو</w:t>
+      </w:r>
+      <w:r>
+        <w:rPr>
+          <w:rFonts w:hint="cs"/>
+          <w:rtl/>
+        </w:rPr>
+        <w:t>ب</w:t>
+      </w:r>
+      <w:r>
+        <w:rPr>
+          <w:rFonts w:hint="cs"/>
+          <w:rtl/>
+        </w:rPr>
+        <w:t xml:space="preserve"> والمجيد لاتحاده بعروسه المحبوبة جدًا. وعند تذكيرهم بتعليم الكلمة حول هذه النقطة، فسيقولون لكم كما قال </w:t>
+      </w:r>
+      <w:proofErr w:type="spellStart"/>
+      <w:r>
+        <w:rPr>
+          <w:rFonts w:hint="cs"/>
+          <w:rtl/>
+        </w:rPr>
+        <w:t>فيستس</w:t>
+      </w:r>
+      <w:proofErr w:type="spellEnd"/>
+      <w:r>
+        <w:rPr>
+          <w:rFonts w:hint="cs"/>
+          <w:rtl/>
+        </w:rPr>
+        <w:t xml:space="preserve"> لبولس: "</w:t>
+      </w:r>
+      <w:r>
+        <w:rPr>
+          <w:rtl/>
+        </w:rPr>
+        <w:t>الْكُتُبُ الْكَثِيرَةُ</w:t>
+      </w:r>
+      <w:r>
+        <w:rPr>
+          <w:rFonts w:hint="cs"/>
+          <w:rtl/>
+        </w:rPr>
+        <w:t xml:space="preserve"> (التعاليم الكثيرة التي تتلقاها)</w:t>
+      </w:r>
+      <w:r>
+        <w:rPr>
+          <w:rtl/>
+        </w:rPr>
+        <w:t xml:space="preserve"> تُحَوِّلُكَ إِلَى الْهَذَيَانِ</w:t>
+      </w:r>
+      <w:r>
+        <w:rPr>
+          <w:rFonts w:hint="cs"/>
+          <w:rtl/>
+        </w:rPr>
+        <w:t>" فمع انتظار الرب يوميًا أيضًا اتحاد التلاميذ، وانفصالهم عن العالم، والحياة الروحية والسماوية التي تميزوا بها في البداية تكون قد تلاشت. حينما قال العبد في قلبه: "سيدي يبطئ قدومه"، ابتدأ بضرب</w:t>
+      </w:r>
+      <w:r>
+        <w:rPr>
+          <w:rFonts w:hint="cs"/>
+          <w:rtl/>
+        </w:rPr>
+        <w:t xml:space="preserve"> رفاقه العبيد وشرب وأكل مع السكارى (متى 24: 48 إلخ). حينما توقفت الكنيسة عن النظر إلى العُلا لتنتظر الرب من السماء، انخفض نظرها نحو الأسفل لتطلب هنا راحتها، </w:t>
+      </w:r>
+    </w:p>
     <w:sectPr>
       <w:footnotePr>
         <w:numRestart w:val="eachSect"/>

</xml_diff>